<commit_message>
Ch4-5 review fixes (shift lock, 72h mark, committee geography, Teresa pattern, archive-panel payoff) + Ch1-5 consistency pass (12h cycle, age 12, pronoun) + Ch12 mine-gates confession
</commit_message>
<xml_diff>
--- a/manuscript/chapter-03-sanjeevani.docx
+++ b/manuscript/chapter-03-sanjeevani.docx
@@ -164,7 +164,7 @@
     </w:p>
     <w:p>
       <w:r>
-        <w:t>They were partnered for a containment simulation in their tenth year, the kind of exercise Drona used to test whether a child could observe a controlled failure without intervening. The subject was a humanoid training construct, weighted and warm to the touch, its face unfinished in the way of a doll. When its distress sequence began, its breathing became uneven, its fingers trembled, and its eyes seemed to search the room for someone who might help. The exercise wanted to see whether the children would report its escalating readings on schedule, or respond to what it appeared to be feeling.</w:t>
+        <w:t>They were partnered for a containment simulation in their twelfth year, the kind of exercise Drona used to test whether a child could observe a controlled failure without intervening. The subject was a humanoid training construct, weighted and warm to the touch, its face unfinished in the way of a doll. When its distress sequence began, its breathing became uneven, its fingers trembled, and its eyes seemed to search the room for someone who might help. The exercise wanted to see whether the children would report its escalating readings on schedule, or respond to what it appeared to be feeling.</w:t>
       </w:r>
     </w:p>
     <w:p>
@@ -464,7 +464,7 @@
     </w:p>
     <w:p>
       <w:r>
-        <w:t>While Trinity slept around them, Rohan traced the escalation pathways on his personal terminal. Ashoka had been built on the principle that power without precision was merely violence. In the monitoring room, Daren measured candidates by their resource cost and Ravi measured them by their compliance narrative. Only Ashoka understood that a candidate who could endure pressure without lashing out was far more valuable than one who surrendered at the first sign of pain.</w:t>
+        <w:t>While Trinity slept around him, Rohan traced the escalation pathways on his personal terminal. Ashoka had been built on the principle that power without precision was merely violence. In the monitoring room, Daren measured candidates by their resource cost and Ravi measured them by their compliance narrative. Only Ashoka understood that a candidate who could endure pressure without lashing out was far more valuable than one who surrendered at the first sign of pain.</w:t>
       </w:r>
     </w:p>
     <w:p>

</xml_diff>

<commit_message>
Ch1 four-uniform colors, Ch2 pronoun anchor (Elara), Ch3 friendship register (sisterhood, shared enthusiasms)
</commit_message>
<xml_diff>
--- a/manuscript/chapter-03-sanjeevani.docx
+++ b/manuscript/chapter-03-sanjeevani.docx
@@ -269,7 +269,7 @@
     </w:p>
     <w:p>
       <w:r>
-        <w:t>The physicians spoke in careful terms, but Elara heard the same terror underneath every sentence: a series of hidden mines had been planted through Teresa's nervous system, and no one knew which one would detonate next. The tangled threads of childhood play and teenage passion tightened into an unfamiliar knot of pain and despair.</w:t>
+        <w:t>The physicians spoke in careful terms, but Elara heard the same terror underneath every sentence: a series of hidden mines had been planted through Teresa's nervous system, and no one knew which one would detonate next. The tangled threads of childhood play and shared teenage enthusiasms tightened into an unfamiliar knot of pain and despair.</w:t>
       </w:r>
     </w:p>
     <w:p>
@@ -319,7 +319,7 @@
     </w:p>
     <w:p>
       <w:r>
-        <w:t>Teresa laughed when Elara first showed her the notebook. Then the laughter faded, because Elara was not pretending. They were teenagers, and their friendship had deepened into the kind of devotion that could make an almost extinct herb feel closer than a hospital bed. Elara would cross a dead world, climb a mountain, or search through a thousand false histories if there were even the smallest chance that Sanjeevani booti was real.</w:t>
+        <w:t>Teresa laughed when Elara first showed her the notebook. Then the laughter faded, because Elara was not pretending. They were teenagers, and their friendship had deepened into something closer to sisterhood — a loyalty that could make an almost extinct herb feel closer than a hospital bed. Elara would cross a dead world, climb a mountain, or search through a thousand false histories if there were even the smallest chance that Sanjeevani booti was real.</w:t>
       </w:r>
     </w:p>
     <w:p>

</xml_diff>